<commit_message>
Complete ligand audit and dossier filtering
</commit_message>
<xml_diff>
--- a/manuscript/output/KinomeX_NAR_manuscript_draft.docx
+++ b/manuscript/output/KinomeX_NAR_manuscript_draft.docx
@@ -44,7 +44,7 @@
         <w:rPr>
           <w:i/>
         </w:rPr>
-        <w:t>Manuscript type: Web Server article | Draft date: 11 August 2026</w:t>
+        <w:t>Manuscript type: Web Server article | Draft date: 13 August 2026</w:t>
       </w:r>
     </w:p>
     <w:p>
@@ -57,7 +57,7 @@
     </w:p>
     <w:p>
       <w:r>
-        <w:t>Protein kinase information is distributed among resources that use different identifiers, coverage criteria and evidence models. KinomeX is a web-based research environment that reconciles a KinHub-indexed human kinase core with reviewed UniProtKB/Swiss-Prot protein kinase entries and connects each catalogue record to source-linked molecular and biomedical evidence. The audited database contains 678 protein entries, comprising 522 KinHub-indexed entries and 156 reviewed UniProt extensions; these represent 536 KinHub kinase-domain rows. Kinase dossiers integrate reviewed functional annotation, 10,034 experimentally determined structures, 45,646 compound or assay records, 36,396 tissue-expression records, 63,649 ClinVar variants and 256 gene-level disease records. The Explorer supports inclusive group, organ and Pharmaceutical Development Interest Score (PDIS) filters, pagination-aware totals and an interactive score distribution. A radial kinome tree, molecular viewers and live STRING association retrieval provide complementary structural and network views. An optional research assistant retrieves KinomeX records and connected source evidence, links database-derived statements to their originating records and requires matched PMID and DOI identifiers for literature-derived claims. KinomeX is intended for evidence inspection and hypothesis generation; PDIS summarizes development-associated evidence and is not a measure of biological importance or clinical utility. The server is available at [PUBLIC HTTPS URL TO BE INSERTED].</w:t>
+        <w:t>Protein kinase information is distributed among resources that use different identifiers, coverage criteria and evidence models. KinomeX is a web-based research environment that reconciles a KinHub-indexed human kinase core with reviewed UniProtKB/Swiss-Prot protein kinase entries and connects each catalogue record to source-linked molecular and biomedical evidence. The audited database contains 678 protein entries, comprising 522 KinHub-indexed entries and 156 reviewed UniProt extensions; these represent 536 KinHub kinase-domain rows. Kinase dossiers integrate reviewed functional annotation, 10,034 experimentally determined structures, 1,021,439 ligand bioactivity records mapped to 566 catalogue genes, 36,396 tissue-expression records, 63,649 ClinVar variants and 256 gene-level disease records. The Explorer supports inclusive group, organ and Pharmaceutical Development Interest Score (PDIS) filters, pagination-aware totals and an interactive score distribution. A radial kinome tree, molecular viewers and live STRING association retrieval provide complementary structural and network views. An optional research assistant retrieves KinomeX records and connected source evidence, links database-derived statements to their originating records and requires matched PMID and DOI identifiers for literature-derived claims. KinomeX is intended for evidence inspection and hypothesis generation; PDIS summarizes development-associated evidence and is not a measure of biological importance or clinical utility. The server is available at [PUBLIC HTTPS URL TO BE INSERTED].</w:t>
       </w:r>
     </w:p>
     <w:p>
@@ -746,7 +746,7 @@
               <w:pStyle w:val="Compact"/>
             </w:pPr>
             <w:r>
-              <w:t>45,646 records; 43,561 ChEMBL and 2,085 PubChem</w:t>
+              <w:t>1,021,439 records; 1,019,354 ChEMBL and 2,085 PubChem; 566 genes</w:t>
             </w:r>
           </w:p>
         </w:tc>
@@ -1023,7 +1023,7 @@
         <w:pStyle w:val="FigureCaption"/>
       </w:pPr>
       <w:r>
-        <w:t>Table 1. Data sources and the audited database snapshot used for this manuscript (11 August 2026). Counts describe records stored in the local KinomeX instance and are not counts of unique biological observations across source databases.</w:t>
+        <w:t>Table 1. Data sources and the audited database snapshot used for this manuscript (13 August 2026). Counts describe records stored in the local KinomeX instance and are not counts of unique biological observations across source databases.</w:t>
       </w:r>
     </w:p>
     <w:p>
@@ -1036,7 +1036,7 @@
     </w:p>
     <w:p>
       <w:r>
-        <w:t>The manuscript snapshot was generated by non-mutating catalogue and database audits. The database contained 157,342 documents, no records matching the project’s synthetic-development signatures and no non-finite numeric values. Required catalogue identifiers and membership labels were present for all 678 entries. Expression, variant, disease, PDIS and structure collections contained no orphan gene symbols. Three historical gene symbols in the bioactivity collection (CDC2L2, PCTK1 and TSSK1) did not match current catalogue symbols and are reported as unresolved rather than silently reassigned. Source-specific record counts and retrieval dates are preserved in audit metadata.</w:t>
+        <w:t>The manuscript snapshot was generated by catalogue and database audits. Required catalogue identifiers and membership labels were present for all 678 entries. The live ligand collection contained 1,019,354 valid ChEMBL activity records and 2,085 PubChem records mapped to 566 catalogue genes. It contained no missing gene symbols, non-finite or incomplete ChEMBL activity records, orphan catalogue mappings or duplicate ChEMBL activity identifiers. A total of 43,720 invalid legacy ChEMBL rows were moved to a quarantine collection and are excluded from the live counts. Historical symbols CDC2L2, PCTK1 and TSSK1 were normalized to current catalogue symbols while preserving the original symbol and mapping basis. The 112 catalogue genes without a connected ligand row are reported as source-coverage gaps, not as evidence of ligand absence. Source-specific record counts and retrieval dates are preserved in audit metadata.</w:t>
       </w:r>
     </w:p>
     <w:p>
@@ -1192,7 +1192,7 @@
     </w:p>
     <w:p>
       <w:r>
-        <w:t>Each dossier begins with a summary, followed by the reviewed UniProtKB/Swiss-Prot function text when available. Separate views present structures, tissue distribution, ligand bioactivity, ClinVar variants, STRING associations, disease annotations and source references. Structure panels link PDB entries and render supported coordinates in interactive molecular viewers. Expression panels retain tissue names and median TPM values from GTEx rather than inferring expression from organ labels. Variant and disease panels preserve ClinVar and UniProt source semantics. The network view queries STRING at use time, allows functional or physical association mode and confidence adjustment, and reports component evidence scores. Association edges are not labeled as direct binding unless the source evidence supports that interpretation.</w:t>
+        <w:t>Each dossier begins with a summary, followed by the reviewed UniProtKB/Swiss-Prot function text when available. Separate views present structures, tissue distribution, ligand bioactivity, ClinVar variants, STRING associations, disease annotations and source references. Structure panels link PDB entries and render supported coordinates in interactive molecular viewers. Expression panels retain tissue names and median TPM values from GTEx rather than inferring expression from organ labels. The ligand view separates curated development candidates from quantitative binding-assay records. Quantitative records are grouped by source compound, retain their best finite standardized value and supporting-assay count, and can be searched or filtered by value range, activity type and assay; resizable columns and 100-row pagination support large result sets. A kinase without a connected row is labeled as unavailable rather than ligand-free. Variant and disease panels preserve ClinVar and UniProt source semantics. The network view queries STRING at use time, allows functional or physical association mode and confidence adjustment, and reports component evidence scores. Association edges are not labeled as direct binding unless the source evidence supports that interpretation.</w:t>
       </w:r>
     </w:p>
     <w:p>
@@ -1228,7 +1228,7 @@
     </w:p>
     <w:p>
       <w:r>
-        <w:t>Several limitations define current development priorities. Bioactivity identifier reconciliation includes three unresolved historical symbols. API caches are process local. Some profile panels and association queries depend on live external services. Automated tests use mocks for MongoDB and scientific APIs and therefore complement, but do not replace, live integration checks. The production server must provide HTTPS access, help material, a licence link and sustained availability before NAR submission. A public code release and archived database snapshot should be deposited before submission to satisfy reproducibility and long-term availability requirements.</w:t>
+        <w:t>Several limitations define current development priorities. Ligand coverage is bounded by the connected ChEMBL and PubChem snapshots and by target-identifier mapping; absence of a row does not establish absence of a ligand. API caches are process local. Some profile panels and association queries depend on live external services. Automated tests use mocks for MongoDB and scientific APIs and therefore complement, but do not replace, live integration checks. The production server must provide HTTPS access, help material, a licence link and sustained availability before NAR submission. A public code release and archived database snapshot should be deposited before submission to satisfy reproducibility and long-term availability requirements.</w:t>
       </w:r>
     </w:p>
     <w:p>
@@ -1253,7 +1253,7 @@
         </w:r>
       </w:hyperlink>
       <w:r>
-        <w:t xml:space="preserve"> and should be archived with a versioned DOI before submission. The manuscript snapshot was audited on 11 August 2026. Original records remain available from UniProt, KinHub/KinMap, STRING, RCSB PDB, AlphaFold DB, ChEMBL, PubChem, GTEx, ClinVar, PubMed and ClinicalTrials.gov under each provider’s terms. KinomeX records preserve source identifiers and links. ChEMBL-derived redistribution remains subject to CC BY-SA 3.0; UniProt, STRING and AlphaFold DB data are CC BY 4.0; RCSB PDB data are provided under CC0. PubMed abstract copyright is publication specific. KinHub roster redistribution should be reviewed with its maintainers because an explicit current data licence was not identified. A complete attribution and reuse notice is included with the software.</w:t>
+        <w:t xml:space="preserve"> and should be archived with a versioned DOI before submission. The manuscript snapshot was audited on 13 August 2026. Original records remain available from UniProt, KinHub/KinMap, STRING, RCSB PDB, AlphaFold DB, ChEMBL, PubChem, GTEx, ClinVar, PubMed and ClinicalTrials.gov under each provider’s terms. KinomeX records preserve source identifiers and links. ChEMBL-derived redistribution remains subject to CC BY-SA 3.0; UniProt, STRING and AlphaFold DB data are CC BY 4.0; RCSB PDB data are provided under CC0. PubMed abstract copyright is publication specific. KinHub roster redistribution should be reviewed with its maintainers because an explicit current data licence was not identified. A complete attribution and reuse notice is included with the software.</w:t>
       </w:r>
     </w:p>
     <w:p>
@@ -1500,7 +1500,7 @@
     </w:p>
     <w:p>
       <w:r>
-        <w:t>☐ Resolve or document the three historical bioactivity symbols and rerun both audits for the final snapshot.</w:t>
+        <w:t>☐ Rerun the catalogue, database and ligand-coverage audits for the final archived snapshot.</w:t>
       </w:r>
     </w:p>
     <w:p>

</xml_diff>